<commit_message>
fix(docx): address independent review findings
</commit_message>
<xml_diff>
--- a/DeCuongChiTietNop.docx
+++ b/DeCuongChiTietNop.docx
@@ -12478,9 +12478,29 @@
       <w:pPr>
         <w:pStyle w:val="QC_Caption"/>
       </w:pPr>
-      <w:r>
-        <w:t>Bảng 1. Trạng thái RC và giới hạn kết luận</w:t>
-      </w:r>
+      <w:bookmarkStart w:id="115" w:name="_QC_TBL_1"/>
+      <w:r>
+        <w:t xml:space="preserve">Bảng </w:t>
+      </w:r>
+      <w:r>
+        <w:fldChar w:fldCharType="begin" w:dirty="true"/>
+      </w:r>
+      <w:r>
+        <w:instrText xml:space="preserve"> SEQ Table \* ARABIC </w:instrText>
+      </w:r>
+      <w:r>
+        <w:fldChar w:fldCharType="separate"/>
+      </w:r>
+      <w:r>
+        <w:t>1</w:t>
+      </w:r>
+      <w:r>
+        <w:fldChar w:fldCharType="end"/>
+      </w:r>
+      <w:r>
+        <w:t>. Trạng thái RC và giới hạn kết luận</w:t>
+      </w:r>
+      <w:bookmarkEnd w:id="115"/>
     </w:p>
     <w:tbl>
       <w:tblPr>
@@ -13141,7 +13161,7 @@
         <w:pStyle w:val="QC_Than"/>
       </w:pPr>
       <w:r>
-        <w:t>Kiến trúc tĩnh phân tách nguồn, trình bày, tương tác, mô phỏng, QA và release. Candidate chạy qua file:// hoặc HTTP mà không cần công cụ phát triển trong gói học viên; manifest và pipeline cho phép tái tạo nội dung. B1, B3, B5–B9 và release inventory hỗ trợ kết luận đạt trong phạm vi cho ba tiêu chí. Điều kiện còn lại không nằm ở kiến trúc mà ở Word round-trip, independent smoke và việc chạy lại các cổng liên quan khi nguồn DOCX hoặc bundle thay đổi.</w:t>
+        <w:t>Kiến trúc tĩnh phân tách nguồn, trình bày, tương tác, mô phỏng, QA và phát hành. RC chạy qua file:// hoặc HTTP mà không cần công cụ phát triển; danh mục và quy trình cho phép tái tạo nội dung. B1, B3, B5–B9 chứng minh ba tiêu chí đạt trong phạm vi. Điều kiện đóng là Word round-trip, smoke độc lập và chạy lại cổng khi nguồn đổi.</w:t>
       </w:r>
     </w:p>
     <w:p>
@@ -13169,7 +13189,7 @@
       <w:r>
         <w:drawing>
           <wp:inline>
-            <wp:extent cx="5472000" cy="4392562"/>
+            <wp:extent cx="5472000" cy="3799406"/>
             <wp:docPr id="3" name="Picture 3" descr="IMG-01 – Trang chủ candidate 2026.08.25 qua HTTP, viewport 1440 × 1000" title="IMG-01 – Trang chủ candidate 2026.08.25 qua HTTP, viewport 1440 × 1000"/>
             <wp:cNvGraphicFramePr>
               <a:graphicFrameLocks noChangeAspect="1"/>
@@ -13190,7 +13210,7 @@
                   <pic:spPr>
                     <a:xfrm>
                       <a:off x="0" y="0"/>
-                      <a:ext cx="5472000" cy="4392562"/>
+                      <a:ext cx="5472000" cy="3799406"/>
                     </a:xfrm>
                     <a:prstGeom prst="rect"/>
                   </pic:spPr>
@@ -13205,9 +13225,29 @@
       <w:pPr>
         <w:pStyle w:val="QC_Caption"/>
       </w:pPr>
-      <w:r>
-        <w:t>Hình 1. Trang chủ RC trên máy tính (IMG-01)</w:t>
-      </w:r>
+      <w:bookmarkStart w:id="116" w:name="_QC_FIG_1"/>
+      <w:r>
+        <w:t xml:space="preserve">Hình </w:t>
+      </w:r>
+      <w:r>
+        <w:fldChar w:fldCharType="begin" w:dirty="true"/>
+      </w:r>
+      <w:r>
+        <w:instrText xml:space="preserve"> SEQ Figure \* ARABIC </w:instrText>
+      </w:r>
+      <w:r>
+        <w:fldChar w:fldCharType="separate"/>
+      </w:r>
+      <w:r>
+        <w:t>1</w:t>
+      </w:r>
+      <w:r>
+        <w:fldChar w:fldCharType="end"/>
+      </w:r>
+      <w:r>
+        <w:t>. Trang chủ RC trên máy tính (IMG-01)</w:t>
+      </w:r>
+      <w:bookmarkEnd w:id="116"/>
     </w:p>
     <w:p>
       <w:pPr>
@@ -13262,9 +13302,29 @@
       <w:pPr>
         <w:pStyle w:val="QC_Caption"/>
       </w:pPr>
-      <w:r>
-        <w:t>Hình 2. Bố cục thích ứng trên màn hình hẹp (IMG-02)</w:t>
-      </w:r>
+      <w:bookmarkStart w:id="117" w:name="_QC_FIG_2"/>
+      <w:r>
+        <w:t xml:space="preserve">Hình </w:t>
+      </w:r>
+      <w:r>
+        <w:fldChar w:fldCharType="begin" w:dirty="true"/>
+      </w:r>
+      <w:r>
+        <w:instrText xml:space="preserve"> SEQ Figure \* ARABIC </w:instrText>
+      </w:r>
+      <w:r>
+        <w:fldChar w:fldCharType="separate"/>
+      </w:r>
+      <w:r>
+        <w:t>2</w:t>
+      </w:r>
+      <w:r>
+        <w:fldChar w:fldCharType="end"/>
+      </w:r>
+      <w:r>
+        <w:t>. Bố cục thích ứng trên màn hình hẹp (IMG-02)</w:t>
+      </w:r>
+      <w:bookmarkEnd w:id="117"/>
     </w:p>
     <w:p>
       <w:pPr>
@@ -13283,7 +13343,7 @@
       <w:r>
         <w:drawing>
           <wp:inline>
-            <wp:extent cx="5472000" cy="4833600"/>
+            <wp:extent cx="5472000" cy="3799406"/>
             <wp:docPr id="8" name="Picture 8" descr="IMG-05 – Tìm kiếm “mô men” hiển thị fallback sang mục lục trên candidate" title="IMG-05 – Tìm kiếm “mô men” hiển thị fallback sang mục lục trên candidate"/>
             <wp:cNvGraphicFramePr>
               <a:graphicFrameLocks noChangeAspect="1"/>
@@ -13304,7 +13364,7 @@
                   <pic:spPr>
                     <a:xfrm>
                       <a:off x="0" y="0"/>
-                      <a:ext cx="5472000" cy="4833600"/>
+                      <a:ext cx="5472000" cy="3799406"/>
                     </a:xfrm>
                     <a:prstGeom prst="rect"/>
                   </pic:spPr>
@@ -13319,9 +13379,29 @@
       <w:pPr>
         <w:pStyle w:val="QC_Caption"/>
       </w:pPr>
-      <w:r>
-        <w:t>Hình 3. Trạng thái tìm kiếm cần đóng trước final release (IMG-05)</w:t>
-      </w:r>
+      <w:bookmarkStart w:id="118" w:name="_QC_FIG_3"/>
+      <w:r>
+        <w:t xml:space="preserve">Hình </w:t>
+      </w:r>
+      <w:r>
+        <w:fldChar w:fldCharType="begin" w:dirty="true"/>
+      </w:r>
+      <w:r>
+        <w:instrText xml:space="preserve"> SEQ Figure \* ARABIC </w:instrText>
+      </w:r>
+      <w:r>
+        <w:fldChar w:fldCharType="separate"/>
+      </w:r>
+      <w:r>
+        <w:t>3</w:t>
+      </w:r>
+      <w:r>
+        <w:fldChar w:fldCharType="end"/>
+      </w:r>
+      <w:r>
+        <w:t>. Trạng thái tìm kiếm cần đóng trước final release (IMG-05)</w:t>
+      </w:r>
+      <w:bookmarkEnd w:id="118"/>
     </w:p>
     <w:p>
       <w:pPr>
@@ -13356,7 +13436,7 @@
       <w:r>
         <w:drawing>
           <wp:inline>
-            <wp:extent cx="3060000" cy="7183812"/>
+            <wp:extent cx="3060000" cy="2124668"/>
             <wp:docPr id="5" name="Picture 5" descr="IMG-03 – Học liệu Chương 1, route #ch1-2-3, candidate 2026.08.25" title="IMG-03 – Học liệu Chương 1, route #ch1-2-3, candidate 2026.08.25"/>
             <wp:cNvGraphicFramePr>
               <a:graphicFrameLocks noChangeAspect="1"/>
@@ -13377,7 +13457,7 @@
                   <pic:spPr>
                     <a:xfrm>
                       <a:off x="0" y="0"/>
-                      <a:ext cx="3060000" cy="7183812"/>
+                      <a:ext cx="3060000" cy="2124668"/>
                     </a:xfrm>
                     <a:prstGeom prst="rect"/>
                   </pic:spPr>
@@ -13392,9 +13472,29 @@
       <w:pPr>
         <w:pStyle w:val="QC_Caption"/>
       </w:pPr>
-      <w:r>
-        <w:t>Hình 4. Hình minh họa lực trong ngữ cảnh bài học (IMG-03)</w:t>
-      </w:r>
+      <w:bookmarkStart w:id="119" w:name="_QC_FIG_4"/>
+      <w:r>
+        <w:t xml:space="preserve">Hình </w:t>
+      </w:r>
+      <w:r>
+        <w:fldChar w:fldCharType="begin" w:dirty="true"/>
+      </w:r>
+      <w:r>
+        <w:instrText xml:space="preserve"> SEQ Figure \* ARABIC </w:instrText>
+      </w:r>
+      <w:r>
+        <w:fldChar w:fldCharType="separate"/>
+      </w:r>
+      <w:r>
+        <w:t>4</w:t>
+      </w:r>
+      <w:r>
+        <w:fldChar w:fldCharType="end"/>
+      </w:r>
+      <w:r>
+        <w:t>. Hình minh họa lực trong ngữ cảnh bài học (IMG-03)</w:t>
+      </w:r>
+      <w:bookmarkEnd w:id="119"/>
     </w:p>
     <w:p>
       <w:pPr>
@@ -13429,7 +13529,7 @@
       <w:r>
         <w:drawing>
           <wp:inline>
-            <wp:extent cx="5148000" cy="2563635"/>
+            <wp:extent cx="5148000" cy="3574441"/>
             <wp:docPr id="6" name="Picture 6" descr="IMG-04 – Mô phỏng mô men lực và cánh tay đòn tại route #ch1-1-4" title="IMG-04 – Mô phỏng mô men lực và cánh tay đòn tại route #ch1-1-4"/>
             <wp:cNvGraphicFramePr>
               <a:graphicFrameLocks noChangeAspect="1"/>
@@ -13450,7 +13550,7 @@
                   <pic:spPr>
                     <a:xfrm>
                       <a:off x="0" y="0"/>
-                      <a:ext cx="5148000" cy="2563635"/>
+                      <a:ext cx="5148000" cy="3574441"/>
                     </a:xfrm>
                     <a:prstGeom prst="rect"/>
                   </pic:spPr>
@@ -13465,9 +13565,29 @@
       <w:pPr>
         <w:pStyle w:val="QC_Caption"/>
       </w:pPr>
-      <w:r>
-        <w:t>Hình 5. Mô phỏng mô men lực trên RC (IMG-04)</w:t>
-      </w:r>
+      <w:bookmarkStart w:id="120" w:name="_QC_FIG_5"/>
+      <w:r>
+        <w:t xml:space="preserve">Hình </w:t>
+      </w:r>
+      <w:r>
+        <w:fldChar w:fldCharType="begin" w:dirty="true"/>
+      </w:r>
+      <w:r>
+        <w:instrText xml:space="preserve"> SEQ Figure \* ARABIC </w:instrText>
+      </w:r>
+      <w:r>
+        <w:fldChar w:fldCharType="separate"/>
+      </w:r>
+      <w:r>
+        <w:t>5</w:t>
+      </w:r>
+      <w:r>
+        <w:fldChar w:fldCharType="end"/>
+      </w:r>
+      <w:r>
+        <w:t>. Mô phỏng mô men lực trên RC (IMG-04)</w:t>
+      </w:r>
+      <w:bookmarkEnd w:id="120"/>
     </w:p>
     <w:p>
       <w:pPr>
@@ -13534,7 +13654,7 @@
       <w:r>
         <w:drawing>
           <wp:inline>
-            <wp:extent cx="5472000" cy="3845600"/>
+            <wp:extent cx="5472000" cy="3799406"/>
             <wp:docPr id="10" name="Picture 10" descr="IMG-06 – Trình đọc PDF tích hợp mở trang 1/139 trên candidate 2026.08.25" title="IMG-06 – Trình đọc PDF tích hợp mở trang 1/139 trên candidate 2026.08.25"/>
             <wp:cNvGraphicFramePr>
               <a:graphicFrameLocks noChangeAspect="1"/>
@@ -13555,7 +13675,7 @@
                   <pic:spPr>
                     <a:xfrm>
                       <a:off x="0" y="0"/>
-                      <a:ext cx="5472000" cy="3845600"/>
+                      <a:ext cx="5472000" cy="3799406"/>
                     </a:xfrm>
                     <a:prstGeom prst="rect"/>
                   </pic:spPr>
@@ -13570,9 +13690,29 @@
       <w:pPr>
         <w:pStyle w:val="QC_Caption"/>
       </w:pPr>
-      <w:r>
-        <w:t>Hình 6. Trình đọc PDF tích hợp của RC (IMG-06)</w:t>
-      </w:r>
+      <w:bookmarkStart w:id="121" w:name="_QC_FIG_6"/>
+      <w:r>
+        <w:t xml:space="preserve">Hình </w:t>
+      </w:r>
+      <w:r>
+        <w:fldChar w:fldCharType="begin" w:dirty="true"/>
+      </w:r>
+      <w:r>
+        <w:instrText xml:space="preserve"> SEQ Figure \* ARABIC </w:instrText>
+      </w:r>
+      <w:r>
+        <w:fldChar w:fldCharType="separate"/>
+      </w:r>
+      <w:r>
+        <w:t>6</w:t>
+      </w:r>
+      <w:r>
+        <w:fldChar w:fldCharType="end"/>
+      </w:r>
+      <w:r>
+        <w:t>. Trình đọc PDF tích hợp của RC (IMG-06)</w:t>
+      </w:r>
+      <w:bookmarkEnd w:id="121"/>
     </w:p>
     <w:p>
       <w:pPr>
@@ -13754,9 +13894,29 @@
       <w:pPr>
         <w:pStyle w:val="QC_Caption"/>
       </w:pPr>
-      <w:r>
-        <w:t>Bảng 2. Hiện vật nội bộ dùng để truy vết kết luận</w:t>
-      </w:r>
+      <w:bookmarkStart w:id="122" w:name="_QC_TBL_2"/>
+      <w:r>
+        <w:t xml:space="preserve">Bảng </w:t>
+      </w:r>
+      <w:r>
+        <w:fldChar w:fldCharType="begin" w:dirty="true"/>
+      </w:r>
+      <w:r>
+        <w:instrText xml:space="preserve"> SEQ Table \* ARABIC </w:instrText>
+      </w:r>
+      <w:r>
+        <w:fldChar w:fldCharType="separate"/>
+      </w:r>
+      <w:r>
+        <w:t>2</w:t>
+      </w:r>
+      <w:r>
+        <w:fldChar w:fldCharType="end"/>
+      </w:r>
+      <w:r>
+        <w:t>. Hiện vật nội bộ dùng để truy vết kết luận</w:t>
+      </w:r>
+      <w:bookmarkEnd w:id="122"/>
     </w:p>
     <w:tbl>
       <w:tblPr>
@@ -14594,9 +14754,29 @@
       <w:pPr>
         <w:pStyle w:val="QC_Caption"/>
       </w:pPr>
-      <w:r>
-        <w:t>Bảng 3. Ma trận 31 tiêu chí và điều kiện đóng</w:t>
-      </w:r>
+      <w:bookmarkStart w:id="123" w:name="_QC_TBL_3"/>
+      <w:r>
+        <w:t xml:space="preserve">Bảng </w:t>
+      </w:r>
+      <w:r>
+        <w:fldChar w:fldCharType="begin" w:dirty="true"/>
+      </w:r>
+      <w:r>
+        <w:instrText xml:space="preserve"> SEQ Table \* ARABIC </w:instrText>
+      </w:r>
+      <w:r>
+        <w:fldChar w:fldCharType="separate"/>
+      </w:r>
+      <w:r>
+        <w:t>3</w:t>
+      </w:r>
+      <w:r>
+        <w:fldChar w:fldCharType="end"/>
+      </w:r>
+      <w:r>
+        <w:t>. Ma trận 31 tiêu chí và điều kiện đóng</w:t>
+      </w:r>
+      <w:bookmarkEnd w:id="123"/>
     </w:p>
     <w:tbl>
       <w:tblPr>

</xml_diff>

<commit_message>
fix(docx): pass OpenXML schema validation
</commit_message>
<xml_diff>
--- a/DeCuongChiTietNop.docx
+++ b/DeCuongChiTietNop.docx
@@ -12533,9 +12533,9 @@
             <w:r>
               <w:rPr>
                 <w:b/>
+                <w:color w:val="FFFFFF"/>
                 <w:sz w:val="19"/>
                 <w:szCs w:val="19"/>
-                <w:color w:val="FFFFFF"/>
               </w:rPr>
               <w:t>Hạng mục</w:t>
             </w:r>
@@ -12554,9 +12554,9 @@
             <w:r>
               <w:rPr>
                 <w:b/>
+                <w:color w:val="FFFFFF"/>
                 <w:sz w:val="19"/>
                 <w:szCs w:val="19"/>
-                <w:color w:val="FFFFFF"/>
               </w:rPr>
               <w:t>Kết quả hiện hành</w:t>
             </w:r>
@@ -12575,9 +12575,9 @@
             <w:r>
               <w:rPr>
                 <w:b/>
+                <w:color w:val="FFFFFF"/>
                 <w:sz w:val="19"/>
                 <w:szCs w:val="19"/>
-                <w:color w:val="FFFFFF"/>
               </w:rPr>
               <w:t>Bằng chứng</w:t>
             </w:r>
@@ -12596,9 +12596,9 @@
             <w:r>
               <w:rPr>
                 <w:b/>
+                <w:color w:val="FFFFFF"/>
                 <w:sz w:val="19"/>
                 <w:szCs w:val="19"/>
-                <w:color w:val="FFFFFF"/>
               </w:rPr>
               <w:t>Ý nghĩa</w:t>
             </w:r>
@@ -13948,9 +13948,9 @@
             <w:r>
               <w:rPr>
                 <w:b/>
+                <w:color w:val="FFFFFF"/>
                 <w:sz w:val="18"/>
                 <w:szCs w:val="18"/>
-                <w:color w:val="FFFFFF"/>
               </w:rPr>
               <w:t>Mã</w:t>
             </w:r>
@@ -13969,9 +13969,9 @@
             <w:r>
               <w:rPr>
                 <w:b/>
+                <w:color w:val="FFFFFF"/>
                 <w:sz w:val="18"/>
                 <w:szCs w:val="18"/>
-                <w:color w:val="FFFFFF"/>
               </w:rPr>
               <w:t>Hiện vật kiểm soát</w:t>
             </w:r>
@@ -13990,9 +13990,9 @@
             <w:r>
               <w:rPr>
                 <w:b/>
+                <w:color w:val="FFFFFF"/>
                 <w:sz w:val="18"/>
                 <w:szCs w:val="18"/>
-                <w:color w:val="FFFFFF"/>
               </w:rPr>
               <w:t>Phạm vi chứng minh</w:t>
             </w:r>
@@ -14812,9 +14812,9 @@
             <w:r>
               <w:rPr>
                 <w:b/>
+                <w:color w:val="FFFFFF"/>
                 <w:sz w:val="15"/>
                 <w:szCs w:val="15"/>
-                <w:color w:val="FFFFFF"/>
               </w:rPr>
               <w:t>Mã</w:t>
             </w:r>
@@ -14833,9 +14833,9 @@
             <w:r>
               <w:rPr>
                 <w:b/>
+                <w:color w:val="FFFFFF"/>
                 <w:sz w:val="15"/>
                 <w:szCs w:val="15"/>
-                <w:color w:val="FFFFFF"/>
               </w:rPr>
               <w:t>Tiêu chí</w:t>
             </w:r>
@@ -14854,9 +14854,9 @@
             <w:r>
               <w:rPr>
                 <w:b/>
+                <w:color w:val="FFFFFF"/>
                 <w:sz w:val="15"/>
                 <w:szCs w:val="15"/>
-                <w:color w:val="FFFFFF"/>
               </w:rPr>
               <w:t>Trạng thái</w:t>
             </w:r>
@@ -14875,9 +14875,9 @@
             <w:r>
               <w:rPr>
                 <w:b/>
+                <w:color w:val="FFFFFF"/>
                 <w:sz w:val="15"/>
                 <w:szCs w:val="15"/>
-                <w:color w:val="FFFFFF"/>
               </w:rPr>
               <w:t>Kết quả hiện hành</w:t>
             </w:r>
@@ -14896,9 +14896,9 @@
             <w:r>
               <w:rPr>
                 <w:b/>
+                <w:color w:val="FFFFFF"/>
                 <w:sz w:val="15"/>
                 <w:szCs w:val="15"/>
-                <w:color w:val="FFFFFF"/>
               </w:rPr>
               <w:t>Bằng chứng B</w:t>
             </w:r>
@@ -14917,9 +14917,9 @@
             <w:r>
               <w:rPr>
                 <w:b/>
+                <w:color w:val="FFFFFF"/>
                 <w:sz w:val="15"/>
                 <w:szCs w:val="15"/>
-                <w:color w:val="FFFFFF"/>
               </w:rPr>
               <w:t>Phép kiểm + kết quả</w:t>
             </w:r>
@@ -14938,9 +14938,9 @@
             <w:r>
               <w:rPr>
                 <w:b/>
+                <w:color w:val="FFFFFF"/>
                 <w:sz w:val="15"/>
                 <w:szCs w:val="15"/>
-                <w:color w:val="FFFFFF"/>
               </w:rPr>
               <w:t>Điều kiện đóng + chủ trì</w:t>
             </w:r>
@@ -14954,9 +14954,9 @@
         <w:tc>
           <w:tcPr>
             <w:tcW w:w="510" w:type="dxa"/>
-            <w:vAlign w:val="center"/>
-            <w:shd w:fill="D9E2F3"/>
             <w:gridSpan w:val="7"/>
+            <w:shd w:fill="D9E2F3" w:val="clear"/>
+            <w:vAlign w:val="center"/>
           </w:tcPr>
           <w:p>
             <w:pPr/>
@@ -15240,9 +15240,9 @@
         <w:tc>
           <w:tcPr>
             <w:tcW w:w="510" w:type="dxa"/>
-            <w:vAlign w:val="center"/>
-            <w:shd w:fill="D9E2F3"/>
             <w:gridSpan w:val="7"/>
+            <w:shd w:fill="D9E2F3" w:val="clear"/>
+            <w:vAlign w:val="center"/>
           </w:tcPr>
           <w:p>
             <w:pPr/>
@@ -15657,9 +15657,9 @@
         <w:tc>
           <w:tcPr>
             <w:tcW w:w="510" w:type="dxa"/>
-            <w:vAlign w:val="center"/>
-            <w:shd w:fill="D9E2F3"/>
             <w:gridSpan w:val="7"/>
+            <w:shd w:fill="D9E2F3" w:val="clear"/>
+            <w:vAlign w:val="center"/>
           </w:tcPr>
           <w:p>
             <w:pPr/>
@@ -16205,9 +16205,9 @@
         <w:tc>
           <w:tcPr>
             <w:tcW w:w="510" w:type="dxa"/>
-            <w:vAlign w:val="center"/>
-            <w:shd w:fill="D9E2F3"/>
             <w:gridSpan w:val="7"/>
+            <w:shd w:fill="D9E2F3" w:val="clear"/>
+            <w:vAlign w:val="center"/>
           </w:tcPr>
           <w:p>
             <w:pPr/>
@@ -16622,9 +16622,9 @@
         <w:tc>
           <w:tcPr>
             <w:tcW w:w="510" w:type="dxa"/>
-            <w:vAlign w:val="center"/>
-            <w:shd w:fill="D9E2F3"/>
             <w:gridSpan w:val="7"/>
+            <w:shd w:fill="D9E2F3" w:val="clear"/>
+            <w:vAlign w:val="center"/>
           </w:tcPr>
           <w:p>
             <w:pPr/>
@@ -17170,9 +17170,9 @@
         <w:tc>
           <w:tcPr>
             <w:tcW w:w="510" w:type="dxa"/>
-            <w:vAlign w:val="center"/>
-            <w:shd w:fill="D9E2F3"/>
             <w:gridSpan w:val="7"/>
+            <w:shd w:fill="D9E2F3" w:val="clear"/>
+            <w:vAlign w:val="center"/>
           </w:tcPr>
           <w:p>
             <w:pPr/>
@@ -17587,9 +17587,9 @@
         <w:tc>
           <w:tcPr>
             <w:tcW w:w="510" w:type="dxa"/>
-            <w:vAlign w:val="center"/>
-            <w:shd w:fill="D9E2F3"/>
             <w:gridSpan w:val="7"/>
+            <w:shd w:fill="D9E2F3" w:val="clear"/>
+            <w:vAlign w:val="center"/>
           </w:tcPr>
           <w:p>
             <w:pPr/>
@@ -18004,9 +18004,9 @@
         <w:tc>
           <w:tcPr>
             <w:tcW w:w="510" w:type="dxa"/>
-            <w:vAlign w:val="center"/>
-            <w:shd w:fill="D9E2F3"/>
             <w:gridSpan w:val="7"/>
+            <w:shd w:fill="D9E2F3" w:val="clear"/>
+            <w:vAlign w:val="center"/>
           </w:tcPr>
           <w:p>
             <w:pPr/>
@@ -18421,9 +18421,9 @@
         <w:tc>
           <w:tcPr>
             <w:tcW w:w="510" w:type="dxa"/>
-            <w:vAlign w:val="center"/>
-            <w:shd w:fill="D9E2F3"/>
             <w:gridSpan w:val="7"/>
+            <w:shd w:fill="D9E2F3" w:val="clear"/>
+            <w:vAlign w:val="center"/>
           </w:tcPr>
           <w:p>
             <w:pPr/>
@@ -18838,9 +18838,9 @@
         <w:tc>
           <w:tcPr>
             <w:tcW w:w="510" w:type="dxa"/>
-            <w:vAlign w:val="center"/>
-            <w:shd w:fill="D9E2F3"/>
             <w:gridSpan w:val="7"/>
+            <w:shd w:fill="D9E2F3" w:val="clear"/>
+            <w:vAlign w:val="center"/>
           </w:tcPr>
           <w:p>
             <w:pPr/>

</xml_diff>